<commit_message>
Redesign publication figures and re-audit M19 package
</commit_message>
<xml_diff>
--- a/submission_package/stage21_m19_scientific_reports_revision/manuscript.docx
+++ b/submission_package/stage21_m19_scientific_reports_revision/manuscript.docx
@@ -1532,7 +1532,7 @@
           <w:rPr>
             <w:rStyle w:val="Hyperlink"/>
           </w:rPr>
-          <w:t xml:space="preserve">https://github.com/denglizhen-113/dkd-focused-universe-reanalysis/tree/v1.1.1</w:t>
+          <w:t xml:space="preserve">https://github.com/denglizhen-113/dkd-focused-universe-reanalysis/tree/v1.1.2</w:t>
         </w:r>
       </w:hyperlink>
       <w:r>
@@ -2357,7 +2357,7 @@
         <w:t xml:space="preserve"> </w:t>
       </w:r>
       <w:r>
-        <w:t xml:space="preserve">Dataset records, rather than PubMed articles, are the screening unit. Full decisions are in Supplementary Table S1.</w:t>
+        <w:t xml:space="preserve">Dataset records, rather than PubMed articles, are the screening unit. The right-hand branches show records removed before screening and exclusions at the title/summary and full-record stages. Full record-level decisions are provided in Supplementary Table S1.</w:t>
       </w:r>
     </w:p>
     <w:p>
@@ -2369,13 +2369,39 @@
           <w:b/>
           <w:bCs/>
         </w:rPr>
-        <w:t xml:space="preserve">Figure 2. Compartment-specific study roles.</w:t>
-      </w:r>
-      <w:r>
-        <w:t xml:space="preserve"> </w:t>
-      </w:r>
-      <w:r>
-        <w:t xml:space="preserve">Bars show DKD and control samples. Compartments and accessions from the same source were not treated as independent effects.</w:t>
+        <w:t xml:space="preserve">Figure 2. Compartment-specific study architecture.</w:t>
+      </w:r>
+      <w:r>
+        <w:t xml:space="preserve"> </w:t>
+      </w:r>
+      <w:r>
+        <w:rPr>
+          <w:b/>
+          <w:bCs/>
+        </w:rPr>
+        <w:t xml:space="preserve">a,</w:t>
+      </w:r>
+      <w:r>
+        <w:t xml:space="preserve"> </w:t>
+      </w:r>
+      <w:r>
+        <w:t xml:space="preserve">Mirrored bars show control and DKD group sizes; color denotes renal compartment.</w:t>
+      </w:r>
+      <w:r>
+        <w:t xml:space="preserve"> </w:t>
+      </w:r>
+      <w:r>
+        <w:rPr>
+          <w:b/>
+          <w:bCs/>
+        </w:rPr>
+        <w:t xml:space="preserve">b,</w:t>
+      </w:r>
+      <w:r>
+        <w:t xml:space="preserve"> </w:t>
+      </w:r>
+      <w:r>
+        <w:t xml:space="preserve">Each row is an independent source study and each symbol is an analyzed GEO Series. Symbol shape denotes the primary, contextual, or sensitivity role; symbol area scales with total sample size. GSE30528/GSE30529 and GSE104948 H7/GSE104954 H7 occupy paired compartment cells on single source-study rows and were not treated as independent source effects.</w:t>
       </w:r>
     </w:p>
     <w:p>
@@ -2393,7 +2419,33 @@
         <w:t xml:space="preserve"> </w:t>
       </w:r>
       <w:r>
-        <w:t xml:space="preserve">The 15 lowest unadjusted modified Hartung–Knapp P values are displayed for visualization; none of 783 genes met BH FDR&lt;0.05.</w:t>
+        <w:rPr>
+          <w:b/>
+          <w:bCs/>
+        </w:rPr>
+        <w:t xml:space="preserve">a,</w:t>
+      </w:r>
+      <w:r>
+        <w:t xml:space="preserve"> </w:t>
+      </w:r>
+      <w:r>
+        <w:t xml:space="preserve">Pooled Hedges' g and 95% modified Hartung–Knapp (HK) confidence intervals for the 12 genes with the lowest unadjusted modified-HK P values among complete three-source estimates; selection is descriptive and is not evidence of multiplicity-controlled significance.</w:t>
+      </w:r>
+      <w:r>
+        <w:t xml:space="preserve"> </w:t>
+      </w:r>
+      <w:r>
+        <w:rPr>
+          <w:b/>
+          <w:bCs/>
+        </w:rPr>
+        <w:t xml:space="preserve">b,</w:t>
+      </w:r>
+      <w:r>
+        <w:t xml:space="preserve"> </w:t>
+      </w:r>
+      <w:r>
+        <w:t xml:space="preserve">Pooled effects and unadjusted modified-HK P values for all 582 genes with complete estimates across the three primary glomerular sources. Benjamini–Hochberg correction was applied across the full 783-gene canonical family, including nonestimable members assigned P=1; no gene met FDR&lt;0.05.</w:t>
       </w:r>
     </w:p>
     <w:p>
@@ -2411,7 +2463,33 @@
         <w:t xml:space="preserve"> </w:t>
       </w:r>
       <w:r>
-        <w:t xml:space="preserve">Values are unaligned mean Hedges' g and maxT-FWER P. Asterisks indicate P&lt;0.05. Replication required concordant significance in at least two sources.</w:t>
+        <w:rPr>
+          <w:b/>
+          <w:bCs/>
+        </w:rPr>
+        <w:t xml:space="preserve">a,</w:t>
+      </w:r>
+      <w:r>
+        <w:t xml:space="preserve"> </w:t>
+      </w:r>
+      <w:r>
+        <w:t xml:space="preserve">Cells show the unaligned mean Hedges' g (DKD minus control) and two-sided maxT family-wise-error-rate P value for each pathway and source. The color scale is symmetric about zero; asterisks and bold text indicate maxT P&lt;0.05.</w:t>
+      </w:r>
+      <w:r>
+        <w:t xml:space="preserve"> </w:t>
+      </w:r>
+      <w:r>
+        <w:rPr>
+          <w:b/>
+          <w:bCs/>
+        </w:rPr>
+        <w:t xml:space="preserve">b,</w:t>
+      </w:r>
+      <w:r>
+        <w:t xml:space="preserve"> </w:t>
+      </w:r>
+      <w:r>
+        <w:t xml:space="preserve">Number of primary sources meeting maxT P&lt;0.05. The dashed line marks the prespecified two-source threshold; a pathway was called replicated only when at least two sources were significant in the same net direction.</w:t>
       </w:r>
     </w:p>
     <w:bookmarkEnd w:id="54"/>

</xml_diff>